<commit_message>
Day14-DocumentQA: guard core AI call against failure, add project.md
InvokePromptAsync in the question loop was unguarded - a transient
failure would crash the whole console session. Wraps it in try/catch
so the loop can keep going. Syncs the docx's Complete Code listing and
replaces missing.md with project.md.
</commit_message>
<xml_diff>
--- a/Day14-DocumentQA.docx
+++ b/Day14-DocumentQA.docx
@@ -1250,39 +1250,190 @@
           <w:rFonts w:ascii="Consolas" w:hAnsi="Consolas"/>
           <w:sz w:val="19"/>
         </w:rPr>
-        <w:t xml:space="preserve">                // 5. Invoke prompt</w:t>
-      </w:r>
-    </w:p>
-    <w:p>
-      <w:pPr>
-        <w:pStyle w:val="NoSpacing"/>
-        <w:rPr>
-          <w:rFonts w:ascii="Consolas" w:hAnsi="Consolas"/>
-          <w:sz w:val="19"/>
-        </w:rPr>
-      </w:pPr>
-      <w:r>
-        <w:rPr>
-          <w:rFonts w:ascii="Consolas" w:hAnsi="Consolas"/>
-          <w:sz w:val="19"/>
-        </w:rPr>
-        <w:t xml:space="preserve">                var result = await kernel.InvokePromptAsync(promptTemplate, arguments);</w:t>
-      </w:r>
-    </w:p>
-    <w:p>
-      <w:pPr>
-        <w:pStyle w:val="NoSpacing"/>
-        <w:rPr>
-          <w:rFonts w:ascii="Consolas" w:hAnsi="Consolas"/>
-          <w:sz w:val="19"/>
-        </w:rPr>
-      </w:pPr>
-      <w:r>
-        <w:rPr>
-          <w:rFonts w:ascii="Consolas" w:hAnsi="Consolas"/>
-          <w:sz w:val="19"/>
-        </w:rPr>
-        <w:t xml:space="preserve">                Console.WriteLine($"\nAI: {result}\n");</w:t>
+        <w:t xml:space="preserve">                </w:t>
+      </w:r>
+      <w:r>
+        <w:rPr>
+          <w:rFonts w:ascii="Consolas" w:hAnsi="Consolas"/>
+          <w:sz w:val="19"/>
+        </w:rPr>
+        <w:t>// 5. Invoke prompt</w:t>
+      </w:r>
+    </w:p>
+    <w:p>
+      <w:pPr>
+        <w:pStyle w:val="NoSpacing"/>
+        <w:rPr>
+          <w:rFonts w:ascii="Consolas" w:hAnsi="Consolas"/>
+          <w:sz w:val="19"/>
+        </w:rPr>
+      </w:pPr>
+      <w:r>
+        <w:rPr>
+          <w:rFonts w:ascii="Consolas" w:hAnsi="Consolas"/>
+          <w:sz w:val="19"/>
+        </w:rPr>
+        <w:t xml:space="preserve">                // A transient failure here (network hiccup, rate limit, etc.) should not</w:t>
+      </w:r>
+    </w:p>
+    <w:p>
+      <w:pPr>
+        <w:pStyle w:val="NoSpacing"/>
+        <w:rPr>
+          <w:rFonts w:ascii="Consolas" w:hAnsi="Consolas"/>
+          <w:sz w:val="19"/>
+        </w:rPr>
+      </w:pPr>
+      <w:r>
+        <w:rPr>
+          <w:rFonts w:ascii="Consolas" w:hAnsi="Consolas"/>
+          <w:sz w:val="19"/>
+        </w:rPr>
+        <w:t xml:space="preserve">                // kill the whole console session - report it and let the student keep asking.</w:t>
+      </w:r>
+    </w:p>
+    <w:p>
+      <w:pPr>
+        <w:pStyle w:val="NoSpacing"/>
+        <w:rPr>
+          <w:rFonts w:ascii="Consolas" w:hAnsi="Consolas"/>
+          <w:sz w:val="19"/>
+        </w:rPr>
+      </w:pPr>
+      <w:r>
+        <w:rPr>
+          <w:rFonts w:ascii="Consolas" w:hAnsi="Consolas"/>
+          <w:sz w:val="19"/>
+        </w:rPr>
+        <w:t xml:space="preserve">                try</w:t>
+      </w:r>
+    </w:p>
+    <w:p>
+      <w:pPr>
+        <w:pStyle w:val="NoSpacing"/>
+        <w:rPr>
+          <w:rFonts w:ascii="Consolas" w:hAnsi="Consolas"/>
+          <w:sz w:val="19"/>
+        </w:rPr>
+      </w:pPr>
+      <w:r>
+        <w:rPr>
+          <w:rFonts w:ascii="Consolas" w:hAnsi="Consolas"/>
+          <w:sz w:val="19"/>
+        </w:rPr>
+        <w:t xml:space="preserve">                {</w:t>
+      </w:r>
+    </w:p>
+    <w:p>
+      <w:pPr>
+        <w:pStyle w:val="NoSpacing"/>
+        <w:rPr>
+          <w:rFonts w:ascii="Consolas" w:hAnsi="Consolas"/>
+          <w:sz w:val="19"/>
+        </w:rPr>
+      </w:pPr>
+      <w:r>
+        <w:rPr>
+          <w:rFonts w:ascii="Consolas" w:hAnsi="Consolas"/>
+          <w:sz w:val="19"/>
+        </w:rPr>
+        <w:t xml:space="preserve">                    var result = await kernel.InvokePromptAsync(promptTemplate, arguments);</w:t>
+      </w:r>
+    </w:p>
+    <w:p>
+      <w:pPr>
+        <w:pStyle w:val="NoSpacing"/>
+        <w:rPr>
+          <w:rFonts w:ascii="Consolas" w:hAnsi="Consolas"/>
+          <w:sz w:val="19"/>
+        </w:rPr>
+      </w:pPr>
+      <w:r>
+        <w:rPr>
+          <w:rFonts w:ascii="Consolas" w:hAnsi="Consolas"/>
+          <w:sz w:val="19"/>
+        </w:rPr>
+        <w:t xml:space="preserve">                    Console.WriteLine($"\nAI: {result}\n");</w:t>
+      </w:r>
+    </w:p>
+    <w:p>
+      <w:pPr>
+        <w:pStyle w:val="NoSpacing"/>
+        <w:rPr>
+          <w:rFonts w:ascii="Consolas" w:hAnsi="Consolas"/>
+          <w:sz w:val="19"/>
+        </w:rPr>
+      </w:pPr>
+      <w:r>
+        <w:rPr>
+          <w:rFonts w:ascii="Consolas" w:hAnsi="Consolas"/>
+          <w:sz w:val="19"/>
+        </w:rPr>
+        <w:t xml:space="preserve">                }</w:t>
+      </w:r>
+    </w:p>
+    <w:p>
+      <w:pPr>
+        <w:pStyle w:val="NoSpacing"/>
+        <w:rPr>
+          <w:rFonts w:ascii="Consolas" w:hAnsi="Consolas"/>
+          <w:sz w:val="19"/>
+        </w:rPr>
+      </w:pPr>
+      <w:r>
+        <w:rPr>
+          <w:rFonts w:ascii="Consolas" w:hAnsi="Consolas"/>
+          <w:sz w:val="19"/>
+        </w:rPr>
+        <w:t xml:space="preserve">                catch (Exception ex)</w:t>
+      </w:r>
+    </w:p>
+    <w:p>
+      <w:pPr>
+        <w:pStyle w:val="NoSpacing"/>
+        <w:rPr>
+          <w:rFonts w:ascii="Consolas" w:hAnsi="Consolas"/>
+          <w:sz w:val="19"/>
+        </w:rPr>
+      </w:pPr>
+      <w:r>
+        <w:rPr>
+          <w:rFonts w:ascii="Consolas" w:hAnsi="Consolas"/>
+          <w:sz w:val="19"/>
+        </w:rPr>
+        <w:t xml:space="preserve">                {</w:t>
+      </w:r>
+    </w:p>
+    <w:p>
+      <w:pPr>
+        <w:pStyle w:val="NoSpacing"/>
+        <w:rPr>
+          <w:rFonts w:ascii="Consolas" w:hAnsi="Consolas"/>
+          <w:sz w:val="19"/>
+        </w:rPr>
+      </w:pPr>
+      <w:r>
+        <w:rPr>
+          <w:rFonts w:ascii="Consolas" w:hAnsi="Consolas"/>
+          <w:sz w:val="19"/>
+        </w:rPr>
+        <w:t xml:space="preserve">                    Console.WriteLine($"\n[Error] The request failed: {ex.Message}\n");</w:t>
+      </w:r>
+    </w:p>
+    <w:p>
+      <w:pPr>
+        <w:pStyle w:val="NoSpacing"/>
+        <w:rPr>
+          <w:rFonts w:ascii="Consolas" w:hAnsi="Consolas"/>
+          <w:sz w:val="19"/>
+        </w:rPr>
+      </w:pPr>
+      <w:r>
+        <w:rPr>
+          <w:rFonts w:ascii="Consolas" w:hAnsi="Consolas"/>
+          <w:sz w:val="19"/>
+        </w:rPr>
+        <w:t xml:space="preserve">                }</w:t>
       </w:r>
     </w:p>
     <w:p>
@@ -1323,6 +1474,7 @@
           <w:rFonts w:ascii="Consolas" w:hAnsi="Consolas"/>
           <w:sz w:val="19"/>
         </w:rPr>
+        <w:lastRenderedPageBreak/>
         <w:t xml:space="preserve">        }</w:t>
       </w:r>
     </w:p>
@@ -1634,7 +1786,11 @@
         <w:t>Step 3: A Prompt Template With Two Named Slots.</w:t>
       </w:r>
       <w:r>
-        <w:t xml:space="preserve"> `promptTemplate` is a raw string containing two Semantic Kernel template variables: `{{$documentContent}}` and `{{$question}}`. This is a step up from a single-variable template — it shows that `KernelArguments` is really just a dictionary of named values that get substituted into the template wherever their placeholder appears, no matter how many placeholders there are.</w:t>
+        <w:t xml:space="preserve"> `promptTemplate` is a raw string containing two Semantic Kernel template variables: `{{$documentContent}}` and `{{$question}}`. This is a step up from a single-variable template — it shows that </w:t>
+      </w:r>
+      <w:r>
+        <w:lastRenderedPageBreak/>
+        <w:t>`KernelArguments` is really just a dictionary of named values that get substituted into the template wherever their placeholder appears, no matter how many placeholders there are.</w:t>
       </w:r>
     </w:p>
     <w:p/>
@@ -1811,6 +1967,7 @@
           <w:rFonts w:ascii="Consolas" w:hAnsi="Consolas"/>
           <w:sz w:val="19"/>
         </w:rPr>
+        <w:lastRenderedPageBreak/>
         <w:t>AI: Error Code E1 indicates low coolant levels. Refill with Grade-A Helium. (Section 3: Troubleshooting)</w:t>
       </w:r>
     </w:p>

</xml_diff>